<commit_message>
Tworzenie dokumentu od zera (Etap 1): nowy dokument z szablonu, styl akapitu, wyrównanie, „＋ Wstaw” (podział strony, linia, data, znaki), zamienniki czcionek Office
</commit_message>
<xml_diff>
--- a/docs/samples/przewodnik.docx
+++ b/docs/samples/przewodnik.docx
@@ -197,6 +197,19 @@
             <w:rStyle w:val="Hyperlink"/>
           </w:rPr>
           <w:t xml:space="preserve">12. Zapis i otwieranie plików</w:t>
+        </w:r>
+      </w:hyperlink>
+    </w:p>
+    <w:p>
+      <w:pPr>
+        <w:pStyle w:val="TOC1"/>
+      </w:pPr>
+      <w:hyperlink w:anchor="_Guide13" w:history="1">
+        <w:r>
+          <w:rPr>
+            <w:rStyle w:val="Hyperlink"/>
+          </w:rPr>
+          <w:t xml:space="preserve">13. Tworzenie dokumentu od zera</w:t>
         </w:r>
       </w:hyperlink>
     </w:p>
@@ -1020,6 +1033,41 @@
       </w:r>
       <w:r>
         <w:t xml:space="preserve">zmień coś, zobacz licznik przy „Zapisz”, a potem użyj „Zapisz jako”, żeby mieć własną kopię tego przewodnika.</w:t>
+      </w:r>
+    </w:p>
+    <w:p>
+      <w:pPr>
+        <w:pStyle w:val="Heading1"/>
+      </w:pPr>
+      <w:bookmarkStart w:id="113" w:name="_Guide13"/>
+      <w:r>
+        <w:t xml:space="preserve">13. Tworzenie dokumentu od zera</w:t>
+      </w:r>
+      <w:bookmarkEnd w:id="113"/>
+    </w:p>
+    <w:p>
+      <w:r>
+        <w:t xml:space="preserve">„Nowy dokument” (ekran startowy, menu ⋯, panel Plik albo Ctrl/⌘+Alt+N) tworzy plik od razu w przeglądarce: pusta kartka A4, pismo z polami {{…}} albo notatka z tytułem i nagłówkami. Pierwsze „Zapisz” zapyta o nazwę i miejsce.</w:t>
+      </w:r>
+    </w:p>
+    <w:p>
+      <w:r>
+        <w:t xml:space="preserve">W trybie Edycja na pasku są: „＋ Wstaw” (podział strony, linia pozioma, dzisiejsza data, znaki specjalne), lista stylu akapitu (Normalny, Tytuł, Podtytuł, Nagłówek 1–3, Cytat) i wyrównanie. Nagłówki od razu trafiają do skrótów sekcji, Struktury i spisu treści w Wordzie. Enter na końcu nagłówka zaczyna zwykły tekst, a Ctrl/⌘+Enter przenosi dalszy tekst na nową stronę.</w:t>
+      </w:r>
+    </w:p>
+    <w:p>
+      <w:pPr>
+        <w:pStyle w:val="Tip"/>
+      </w:pPr>
+      <w:r>
+        <w:rPr>
+          <w:b/>
+          <w:color w:val="1F5FBF"/>
+        </w:rPr>
+        <w:t xml:space="preserve">Spróbuj: </w:t>
+      </w:r>
+      <w:r>
+        <w:t xml:space="preserve">kliknij na końcu tego akapitu i wybierz z listy stylu „Nagłówek 2” — pojawi się w skrótach sekcji. Potem „＋ Wstaw” → „Dzisiejsza data”, a na koniec ↶ cofnie jedno i drugie.</w:t>
       </w:r>
     </w:p>
     <w:sectPr>

</xml_diff>

<commit_message>
Tworzenie od zera (Etap 2): listy, linki (Ctrl+K, karta linku), pola formularza w zdaniu, spis treści; akapity z linkami i polami edytowalne; tap na iOS w okienkach; płynne intro 2 s
</commit_message>
<xml_diff>
--- a/docs/samples/przewodnik.docx
+++ b/docs/samples/przewodnik.docx
@@ -1068,6 +1068,31 @@
       </w:r>
       <w:r>
         <w:t xml:space="preserve">kliknij na końcu tego akapitu i wybierz z listy stylu „Nagłówek 2” — pojawi się w skrótach sekcji. Potem „＋ Wstaw” → „Dzisiejsza data”, a na koniec ↶ cofnie jedno i drugie.</w:t>
+      </w:r>
+    </w:p>
+    <w:p>
+      <w:r>
+        <w:t xml:space="preserve">Przycisk listy robi listę punktowaną albo numerowaną (drugi raz — zdejmuje). Tab / Shift+Tab albo „Głębiej / Płycej” w tym samym okienku zmienia poziom punktu; Enter w pustym punkcie kończy listę, a Backspace na początku punktu zdejmuje numerację.</w:t>
+      </w:r>
+    </w:p>
+    <w:p>
+      <w:r>
+        <w:t xml:space="preserve">Ctrl/⌘+K (albo „＋ Wstaw” → „Link…”) robi link z zaznaczonego tekstu — do strony WWW albo do nagłówka w tym dokumencie. Gdy kursor stoi w linku, pod nim pojawia się mała karta: otwórz, zmień, usuń. W „＋ Wstaw” są też pola formularza (tekst, lista wyboru, data, pole wyboru) — wstawiasz je w środek zdania i dalej piszesz obok — oraz spis treści z nagłówków 1–3, który później aktualizujesz tym samym przyciskiem.</w:t>
+      </w:r>
+    </w:p>
+    <w:p>
+      <w:pPr>
+        <w:pStyle w:val="Tip"/>
+      </w:pPr>
+      <w:r>
+        <w:rPr>
+          <w:b/>
+          <w:color w:val="1F5FBF"/>
+        </w:rPr>
+        <w:t xml:space="preserve">Spróbuj: </w:t>
+      </w:r>
+      <w:r>
+        <w:t xml:space="preserve">zaznacz słowo „spis treści” w zdaniu wyżej, naciśnij Ctrl/⌘+K, przełącz na „Miejsce w dokumencie” i wybierz rozdział 1 — kliknięcie w link (albo „Otwórz” na karcie) przeniesie Cię tam.</w:t>
       </w:r>
     </w:p>
     <w:sectPr>

</xml_diff>

<commit_message>
Tworzenie od zera (Etap 3): tabele (siatka, Tab po komórkach, przycisk „Tabela”, scalone komórki jak w Wordzie) i obrazy (plik, aparat, wklejenie; karta: rozmiar, wyrównanie, tekst alternatywny, usuń)
</commit_message>
<xml_diff>
--- a/docs/samples/przewodnik.docx
+++ b/docs/samples/przewodnik.docx
@@ -1093,6 +1093,31 @@
       </w:r>
       <w:r>
         <w:t xml:space="preserve">zaznacz słowo „spis treści” w zdaniu wyżej, naciśnij Ctrl/⌘+K, przełącz na „Miejsce w dokumencie” i wybierz rozdział 1 — kliknięcie w link (albo „Otwórz” na karcie) przeniesie Cię tam.</w:t>
+      </w:r>
+    </w:p>
+    <w:p>
+      <w:r>
+        <w:t xml:space="preserve">„＋ Wstaw → Tabela” pokazuje siatkę — wybierasz liczbę kolumn i wierszy. Tab przechodzi do następnej komórki, a w ostatniej dokłada wiersz. Gdy kursor stoi w tabeli, na pasku pojawia się przycisk „Tabela”: wiersz powyżej / poniżej, kolumna z lewej / z prawej, usuwanie wiersza, kolumny albo całej tabeli.</w:t>
+      </w:r>
+    </w:p>
+    <w:p>
+      <w:r>
+        <w:t xml:space="preserve">„＋ Wstaw → Obraz…” wstawia zdjęcie z dysku (na telefonie także z aparatu), a Ctrl/⌘+V wkleja zrzut ekranu. Duże zdjęcia są zmniejszane, żeby plik nie puchł. Kliknięcie obrazu pokazuje kartę: suwak szerokości, wyrównanie, tekst alternatywny (opis dla czytników ekranu) i usuwanie — działa też z obrazami z plików Worda.</w:t>
+      </w:r>
+    </w:p>
+    <w:p>
+      <w:pPr>
+        <w:pStyle w:val="Tip"/>
+      </w:pPr>
+      <w:r>
+        <w:rPr>
+          <w:b/>
+          <w:color w:val="1F5FBF"/>
+        </w:rPr>
+        <w:t xml:space="preserve">Spróbuj: </w:t>
+      </w:r>
+      <w:r>
+        <w:t xml:space="preserve">kliknij w komórkę tabeli z rozdziału 8 — na pasku pojawi się „Tabela”; dodaj wiersz poniżej i wpisz coś, przechodząc Tabem.</w:t>
       </w:r>
     </w:p>
     <w:sectPr>

</xml_diff>

<commit_message>
Tworzenie od zera (Etap 4): kolor czcionki i wyróżnienie (paleta jak w Wordzie), komentarze (dodaj, odpowiedz, rozwiąż, usuń; karta i podświetlenie), nagłówek i stopka z numerem strony; komentarze i wyróżnienie przetrwają edycję akapitu; testy ~2,5× szybsze
</commit_message>
<xml_diff>
--- a/docs/samples/przewodnik.docx
+++ b/docs/samples/przewodnik.docx
@@ -1118,6 +1118,36 @@
       </w:r>
       <w:r>
         <w:t xml:space="preserve">kliknij w komórkę tabeli z rozdziału 8 — na pasku pojawi się „Tabela”; dodaj wiersz poniżej i wpisz coś, przechodząc Tabem.</w:t>
+      </w:r>
+    </w:p>
+    <w:p>
+      <w:r>
+        <w:t xml:space="preserve">Przycisk „A” na pasku to kolor czcionki (paleta jak w Wordzie, „Automatyczny”, „Więcej kolorów…”) i wyróżnienie tekstu (zakreślacz). Bez zaznaczenia kolor obowiązuje dla dalszego pisania.</w:t>
+      </w:r>
+    </w:p>
+    <w:p>
+      <w:r>
+        <w:t xml:space="preserve">Komentarz: zaznacz tekst i Ctrl/⌘+Alt+M (albo „＋ Wstaw → Komentarz”). Komentowany tekst jest podświetlony; gdy kursor w nim stoi, karta pozwala odpowiedzieć, oznaczyć jako rozwiązany albo usunąć. Wszystkie komentarze są też w panelu Recenzja.</w:t>
+      </w:r>
+    </w:p>
+    <w:p>
+      <w:r>
+        <w:t xml:space="preserve">„＋ Wstaw → Nagłówek, stopka, numer strony…” (albo kliknięcie w nagłówek/stopkę w Edycji): tekst u góry i na dole każdej strony, numer strony („1”, „Strona 1”, „Strona 1 z 5”, „– 1 –”) i inna pierwsza strona, np. tytułowa bez numeru.</w:t>
+      </w:r>
+    </w:p>
+    <w:p>
+      <w:pPr>
+        <w:pStyle w:val="Tip"/>
+      </w:pPr>
+      <w:r>
+        <w:rPr>
+          <w:b/>
+          <w:color w:val="1F5FBF"/>
+        </w:rPr>
+        <w:t xml:space="preserve">Spróbuj: </w:t>
+      </w:r>
+      <w:r>
+        <w:t xml:space="preserve">zaznacz słowo w tym akapicie, naciśnij Ctrl/⌘+Alt+M i dodaj komentarz — potem kliknij w podświetlony tekst i odpowiedz na niego.</w:t>
       </w:r>
     </w:p>
     <w:sectPr>

</xml_diff>

<commit_message>
PDF → DOCX na urządzeniu (Paczka L): odczyt pdf.js, akapity/tabele/kolumny/obrazy, osadzanie czcionek, OCR skanów (druk ≥92%, pismo odręczne zostaje obrazem), okno postępu z Anuluj; podgląd: tabulatory wg pozycji, interlinia „dokładnie” jak w Wordzie, obrazy przypięte do strony; widok mobilny: wszystkie kartki na szerokość ekranu; przewodnik rozdz. 14, test:pdf; release 20261002-10
</commit_message>
<xml_diff>
--- a/docs/samples/przewodnik.docx
+++ b/docs/samples/przewodnik.docx
@@ -210,6 +210,19 @@
             <w:rStyle w:val="Hyperlink"/>
           </w:rPr>
           <w:t xml:space="preserve">13. Tworzenie dokumentu od zera</w:t>
+        </w:r>
+      </w:hyperlink>
+    </w:p>
+    <w:p>
+      <w:pPr>
+        <w:pStyle w:val="TOC1"/>
+      </w:pPr>
+      <w:hyperlink w:anchor="_Guide14" w:history="1">
+        <w:r>
+          <w:rPr>
+            <w:rStyle w:val="Hyperlink"/>
+          </w:rPr>
+          <w:t xml:space="preserve">14. PDF → Word (.docx)</w:t>
         </w:r>
       </w:hyperlink>
     </w:p>
@@ -1150,6 +1163,82 @@
         <w:t xml:space="preserve">zaznacz słowo w tym akapicie, naciśnij Ctrl/⌘+Alt+M i dodaj komentarz — potem kliknij w podświetlony tekst i odpowiedz na niego.</w:t>
       </w:r>
     </w:p>
+    <w:p>
+      <w:pPr>
+        <w:pStyle w:val="Heading1"/>
+      </w:pPr>
+      <w:bookmarkStart w:id="114" w:name="_Guide14"/>
+      <w:r>
+        <w:t xml:space="preserve">14. PDF → Word (.docx)</w:t>
+      </w:r>
+      <w:bookmarkEnd w:id="114"/>
+    </w:p>
+    <w:p>
+      <w:r>
+        <w:t xml:space="preserve">Otwórz plik .pdf tak jak .docx (Otwórz, przeciągnięcie do okna, „Otwórz za pomocą”) — aplikacja zamieni go w edytowalny dokument Worda. Wszystko dzieje się na tym urządzeniu: plik nigdzie nie jest wysyłany, działa też bez internetu. Okienko pokazuje postęp strona po stronie; „Anuluj” przerywa w każdej chwili.</w:t>
+      </w:r>
+    </w:p>
+    <w:p>
+      <w:pPr>
+        <w:pStyle w:val="ListParagraph"/>
+        <w:numPr>
+          <w:ilvl w:val="0"/>
+          <w:numId w:val="1"/>
+        </w:numPr>
+      </w:pPr>
+      <w:r>
+        <w:t xml:space="preserve">Zostają: akapity z wyrównaniem i wcięciami, nagłówki (trafiają do skrótów sekcji i Struktury), punktory, tabele z liniami i tłem komórek, obrazy, linki, spis treści z kropkami, numery stron w stopce, kolumny i układ kilku kart na stronie.</w:t>
+      </w:r>
+    </w:p>
+    <w:p>
+      <w:pPr>
+        <w:pStyle w:val="ListParagraph"/>
+        <w:numPr>
+          <w:ilvl w:val="0"/>
+          <w:numId w:val="1"/>
+        </w:numPr>
+      </w:pPr>
+      <w:r>
+        <w:t xml:space="preserve">Czcionki z PDF są osadzane w pliku, gdy na komputerze może ich brakować — tekst zawija się jak w oryginale.</w:t>
+      </w:r>
+    </w:p>
+    <w:p>
+      <w:pPr>
+        <w:pStyle w:val="ListParagraph"/>
+        <w:numPr>
+          <w:ilvl w:val="0"/>
+          <w:numId w:val="1"/>
+        </w:numPr>
+      </w:pPr>
+      <w:r>
+        <w:t xml:space="preserve">Wypełnione pola formularza PDF trafiają do tekstu z polskimi literami, nawet gdy PDF rysował je bez „Ł” czy „Ś”.</w:t>
+      </w:r>
+    </w:p>
+    <w:p>
+      <w:r>
+        <w:t xml:space="preserve">Skan (zdjęcie strony) — aplikacja zapyta, czy rozpoznać tekst (OCR). Rozpoznany druk staje się zwykłym tekstem, a skan zostaje pod spodem jako tło: kolory, linie tabel i pieczątki widać jak w oryginale. Na tekst zamieniane są tylko słowa rozpoznane z dużą pewnością; pismo odręczne i nieczytelne fragmenty zostają na obrazie bez zmian (rozpoznawanie pisma odręcznego — do poprawy w przyszłości).</w:t>
+      </w:r>
+    </w:p>
+    <w:p>
+      <w:r>
+        <w:t xml:space="preserve">Po konwersji dokument jest nowy i niezapisany — „Zapisz” zapyta o nazwę i miejsce pliku .docx. Sprawdź wynik, zwłaszcza po OCR.</w:t>
+      </w:r>
+    </w:p>
+    <w:p>
+      <w:pPr>
+        <w:pStyle w:val="Tip"/>
+      </w:pPr>
+      <w:r>
+        <w:rPr>
+          <w:b/>
+          <w:color w:val="1F5FBF"/>
+        </w:rPr>
+        <w:t xml:space="preserve">Spróbuj: </w:t>
+      </w:r>
+      <w:r>
+        <w:t xml:space="preserve">zapisz dowolną stronę WWW jako PDF (Drukuj → Zapisz jako PDF) i otwórz ją tutaj — zobaczysz, jak wygląda po zamianie na Worda.</w:t>
+      </w:r>
+    </w:p>
     <w:sectPr>
       <w:pgSz w:w="11906" w:h="16838"/>
       <w:pgMar w:top="1134" w:right="1134" w:bottom="1134" w:left="1134" w:header="567" w:footer="567" w:gutter="0"/>

</xml_diff>

<commit_message>
Runda poprawek: przewinięcie stoi w miejscu po komentarzu, tabeli, kolorze, Cofnij i Czytanie⇄Edycja (kotwica = akapit, nie piksele); komentarze: edycja treści i odpowiedzi, B/I/U z paska i Ctrl/⌘+B/I/U, wklejanie z formatowaniem jak w Wordzie, „Więcej ↓” przy długim, skala z przybliżeniem; pola formularza bez przerysowania dokumentu; zakładki zostają wokół tekstu przy pisaniu, „Wielkie litery/Przytnij/Prefiks” nie gubią formatowania i komentarzy, skasowany komentowany tekst usuwa komentarz; „Układ” na pasku (marginesy, orientacja, rozmiar, wyrównanie w pionie) zamiast w „Wstaw”; stabilny suwak rozmiaru obrazu; link do obrazu z podglądem po najechaniu; testy comments2, image-card, forms-light, integrity; release 20261005-01
</commit_message>
<xml_diff>
--- a/docs/samples/przewodnik.docx
+++ b/docs/samples/przewodnik.docx
@@ -1142,7 +1142,7 @@
     </w:p>
     <w:p>
       <w:r>
-        <w:t xml:space="preserve">Ctrl/⌘+K (albo „＋ Wstaw” → „Link…”) robi link z zaznaczonego tekstu — do strony WWW albo do nagłówka w tym dokumencie. Gdy kursor stoi w linku, pod nim pojawia się mała karta: otwórz, zmień, usuń. W „＋ Wstaw” są też pola formularza (tekst, lista wyboru, data, pole wyboru) — wstawiasz je w środek zdania i dalej piszesz obok — oraz spis treści z nagłówków 1–3, który później aktualizujesz tym samym przyciskiem.</w:t>
+        <w:t xml:space="preserve">Ctrl/⌘+K (albo „＋ Wstaw” → „Link…”) robi link z zaznaczonego tekstu — do strony WWW albo do miejsca w tym dokumencie: nagłówka lub obrazu (najechanie na link do obrazu pokazuje jego podgląd bez przewijania, na dotyku przytrzymanie palca). Gdy kursor stoi w linku, pod nim pojawia się mała karta: otwórz, zmień, usuń. W „＋ Wstaw” są też pola formularza (tekst, lista wyboru, data, pole wyboru) — wstawiasz je w środek zdania i dalej piszesz obok — oraz spis treści z nagłówków 1–3, który później aktualizujesz tym samym przyciskiem.</w:t>
       </w:r>
     </w:p>
     <w:p>
@@ -1192,12 +1192,12 @@
     </w:p>
     <w:p>
       <w:r>
-        <w:t xml:space="preserve">Komentarz: zaznacz tekst i Ctrl/⌘+Alt+M (albo „＋ Wstaw → Komentarz”). Komentowany tekst jest podświetlony; gdy kursor w nim stoi, karta pozwala odpowiedzieć, oznaczyć jako rozwiązany albo usunąć. Wszystkie komentarze są też w panelu Recenzja.</w:t>
-      </w:r>
-    </w:p>
-    <w:p>
-      <w:r>
-        <w:t xml:space="preserve">„＋ Wstaw → Układ strony…”: marginesy jak w Wordzie (Normalne 2,5 cm, Wąskie, Umiarkowane, Szerokie albo własne w cm), orientacja pionowa/pozioma i rozmiar papieru (A4, A5, Letter…). Zmiany widać na kartkach w Widoku desktopowym i w Podglądzie wydruku. Marginesy i układ strony są też w menu ⋯ i pod przyciskiem „Marginesy” w Podglądzie wydruku. W Widoku desktopowym strony mają dolny i górny margines oraz przerwę między kartkami — dwuklik w przerwę ukrywa biały obszar (sama kreska), opcja też w panelu Widok.</w:t>
+        <w:t xml:space="preserve">Komentarz: zaznacz tekst i Ctrl/⌘+Alt+M (albo „＋ Wstaw → Komentarz”). Pogrubienie, kursywę i podkreślenie w treści komentarza robią te same przyciski B I U na pasku (i Ctrl/⌘+B, I, U); wklejony tekst zachowuje takie formatowanie. Komentowany tekst jest podświetlony; gdy kursor w nim stoi, karta pozwala odpowiedzieć, poprawić treść (ołówek przy komentarzu i przy każdej odpowiedzi), oznaczyć jako rozwiązany albo usunąć. Długi komentarz ma na dole „Więcej ↓”, a karta rośnie razem z przybliżeniem dokumentu. Wszystkie komentarze są też w panelu Recenzja.</w:t>
+      </w:r>
+    </w:p>
+    <w:p>
+      <w:r>
+        <w:t xml:space="preserve">Przycisk „Układ” na pasku (jak karta Układ w Wordzie): marginesy jak w Wordzie (Normalne 2,5 cm, Wąskie, Umiarkowane, Szerokie albo własne w cm), orientacja pionowa/pozioma i rozmiar papieru (A4, A5, Letter…) oraz wyrównanie strony w pionie (np. strona tytułowa na środku). Zmiany widać na kartkach w Widoku desktopowym i w Podglądzie wydruku. Marginesy i układ strony są też w menu ⋯ i pod przyciskiem „Marginesy” w Podglądzie wydruku. W Widoku desktopowym strony mają dolny i górny margines oraz przerwę między kartkami — dwuklik w przerwę ukrywa biały obszar (sama kreska), opcja też w panelu Widok.</w:t>
       </w:r>
     </w:p>
     <w:p>

</xml_diff>

<commit_message>
Przewodnik aktualny: obraz z podpisem „Rysunek 1” i link do niego (podgląd i suwak do wypróbowania), wskazówki do edycji i pogrubiania komentarzy oraz „Układu”; iPhone: przytrzymanie linku do obrazu pokazuje podgląd zamiast menu Safari (bez zaznaczania słowa), stuknięcie obrazu w Edycji nie wysuwa klawiatury nad kartą, procent suwaka w Widoku mobilnym liczony od strony z pliku (bez „dociągania”); komentarz na telefonie: układ stoi w trakcie pisania, po dodaniu/odpowiedzi/edycji akapit wraca w to samo miejsce ekranu, karta przelicza się po schowaniu klawiatury, minimalna wysokość zależna od ekranu i wielkości tekstu (telefon 6 linijek / 38%, komputer 8 / 40%); podgląd linku do obrazu po przewinięciu pod kursor; testy guide, image-card, comments2 rozszerzone; release 20261005-02
</commit_message>
<xml_diff>
--- a/docs/samples/przewodnik.docx
+++ b/docs/samples/przewodnik.docx
@@ -1020,6 +1020,106 @@
       </w:r>
     </w:p>
     <w:p>
+      <w:r>
+        <w:t xml:space="preserve">Celem linku może być też obraz — jak w Wordzie (Link → Miejsce w tym dokumencie). Przykład: </w:t>
+      </w:r>
+      <w:hyperlink w:anchor="_RefRysunek1" w:history="1">
+        <w:r>
+          <w:rPr>
+            <w:rStyle w:val="Hyperlink"/>
+          </w:rPr>
+          <w:t xml:space="preserve">Rysunek 1</w:t>
+        </w:r>
+      </w:hyperlink>
+      <w:r>
+        <w:t xml:space="preserve"> pokazuje ikonę aplikacji, która stoi kilka akapitów niżej.</w:t>
+      </w:r>
+    </w:p>
+    <w:p>
+      <w:pPr>
+        <w:pStyle w:val="Tip"/>
+      </w:pPr>
+      <w:r>
+        <w:rPr>
+          <w:b/>
+          <w:color w:val="1F5FBF"/>
+        </w:rPr>
+        <w:t xml:space="preserve">Spróbuj: </w:t>
+      </w:r>
+      <w:r>
+        <w:t xml:space="preserve">najedź myszą na „Rysunek 1” w zdaniu wyżej (na telefonie przytrzymaj na nim palec) — obraz pokaże się w okienku, a dokument się nie przesunie. Kliknięcie (stuknięcie) przeniesie do obrazu, „↩ Wróć” wraca tutaj.</w:t>
+      </w:r>
+    </w:p>
+    <w:p>
+      <w:r>
+        <w:t xml:space="preserve">Obraz w dokumencie zmieniasz w trybie Edycja: kliknięcie obrazu pokazuje kartę z suwakiem szerokości (procent szerokości tekstu), wyrównaniem, tekstem alternatywnym i usuwaniem.</w:t>
+      </w:r>
+    </w:p>
+    <w:p>
+      <w:pPr>
+        <w:pStyle w:val="Tip"/>
+      </w:pPr>
+      <w:r>
+        <w:rPr>
+          <w:b/>
+          <w:color w:val="1F5FBF"/>
+        </w:rPr>
+        <w:t xml:space="preserve">Spróbuj: </w:t>
+      </w:r>
+      <w:r>
+        <w:t xml:space="preserve">przełącz na Edycja, kliknij obraz poniżej i przeciągnij suwak — karta stoi w miejscu, obraz zmienia się na żywo, a jeden ↶ cofa całą zmianę.</w:t>
+      </w:r>
+    </w:p>
+    <w:p>
+      <w:pPr>
+        <w:jc w:val="center"/>
+      </w:pPr>
+      <w:r>
+        <w:drawing>
+          <wp:inline xmlns:wp="http://schemas.openxmlformats.org/drawingml/2006/wordprocessingDrawing" distT="0" distB="0" distL="0" distR="0">
+            <wp:extent cx="1800000" cy="1800000"/>
+            <wp:docPr id="1" name="Ikona aplikacji" descr="Ikona Documents Workbench: kartka z zagiętym rogiem na niebieskim tle"/>
+            <a:graphic xmlns:a="http://schemas.openxmlformats.org/drawingml/2006/main">
+              <a:graphicData uri="http://schemas.openxmlformats.org/drawingml/2006/picture">
+                <pic:pic xmlns:pic="http://schemas.openxmlformats.org/drawingml/2006/picture">
+                  <pic:nvPicPr>
+                    <pic:cNvPr id="1" name="Ikona aplikacji"/>
+                    <pic:cNvPicPr/>
+                  </pic:nvPicPr>
+                  <pic:blipFill>
+                    <a:blip r:embed="rIdImg1"/>
+                    <a:stretch>
+                      <a:fillRect/>
+                    </a:stretch>
+                  </pic:blipFill>
+                  <pic:spPr>
+                    <a:xfrm>
+                      <a:off x="0" y="0"/>
+                      <a:ext cx="1800000" cy="1800000"/>
+                    </a:xfrm>
+                    <a:prstGeom prst="rect">
+                      <a:avLst/>
+                    </a:prstGeom>
+                  </pic:spPr>
+                </pic:pic>
+              </a:graphicData>
+            </a:graphic>
+          </wp:inline>
+        </w:drawing>
+      </w:r>
+    </w:p>
+    <w:p>
+      <w:pPr>
+        <w:pStyle w:val="Caption"/>
+        <w:jc w:val="center"/>
+      </w:pPr>
+      <w:bookmarkStart w:id="201" w:name="_RefRysunek1"/>
+      <w:r>
+        <w:t xml:space="preserve">Rysunek 1. Ikona aplikacji Documents Workbench</w:t>
+      </w:r>
+      <w:bookmarkEnd w:id="201"/>
+    </w:p>
+    <w:p>
       <w:pPr>
         <w:pStyle w:val="Heading1"/>
       </w:pPr>
@@ -1217,7 +1317,7 @@
         <w:t xml:space="preserve">Spróbuj: </w:t>
       </w:r>
       <w:r>
-        <w:t xml:space="preserve">zaznacz słowo w tym akapicie, naciśnij Ctrl/⌘+Alt+M i dodaj komentarz — potem kliknij w podświetlony tekst i odpowiedz na niego.</w:t>
+        <w:t xml:space="preserve">zaznacz słowo w tym akapicie i naciśnij Ctrl/⌘+Alt+M; w okienku kliknij B na pasku i dopisz pogrubione słowo, potem „Dodaj komentarz”. Kliknij w podświetlony tekst — ołówkiem poprawisz treść, możesz też odpowiedzieć. Na koniec „Układ” na pasku → „Wąskie”: w Widoku desktopowym kartki od razu mają węższe marginesy (↶ cofa).</w:t>
       </w:r>
     </w:p>
     <w:p>
@@ -1520,6 +1620,18 @@
       <w:ind w:left="240"/>
     </w:pPr>
   </w:style>
+  <w:style w:type="paragraph" w:styleId="Caption">
+    <w:name w:val="caption"/>
+    <w:basedOn w:val="Normal"/>
+    <w:pPr>
+      <w:spacing w:after="200"/>
+    </w:pPr>
+    <w:rPr>
+      <w:i/>
+      <w:color w:val="44546A"/>
+      <w:sz w:val="18"/>
+    </w:rPr>
+  </w:style>
   <w:style w:type="character" w:styleId="Hyperlink">
     <w:name w:val="Hyperlink"/>
     <w:rPr>

</xml_diff>

<commit_message>
fix(ooxml): generate schema-valid Word samples
</commit_message>
<xml_diff>
--- a/docs/samples/przewodnik.docx
+++ b/docs/samples/przewodnik.docx
@@ -1582,12 +1582,12 @@
         <w:left w:val="single" w:sz="18" w:space="8" w:color="1F5FBF"/>
       </w:pBdr>
       <w:shd w:val="clear" w:color="auto" w:fill="EEF3FB"/>
+      <w:spacing w:before="60" w:after="180"/>
       <w:ind w:left="240"/>
-      <w:spacing w:before="60" w:after="180"/>
     </w:pPr>
     <w:rPr>
+      <w:color w:val="33415C"/>
       <w:sz w:val="20"/>
-      <w:color w:val="33415C"/>
     </w:rPr>
   </w:style>
   <w:style w:type="paragraph" w:styleId="ListParagraph">

</xml_diff>

<commit_message>
Documents Workbench: pola formularza z PDF jako pola Worda — konwersja robi z pól PDF (Miejscowość, Teren nr, lista klatek) kontrolki tekstowe Worda z nazwą z napisu przed polem, kropki zostają tabulatorem, puste pole = pusta kontrolka między kropkami; przełącznik w panelu Widok (wyłączony = dawny zwykły tekst); Tab/Shift+Tab w okienku pola przechodzi do następnego; poprawki pól: zakres za tabulatorem nie rozcina go (wiersz się nie łamie), ramka pola nie przesuwa tekstu; miernik pdf:score bez wyróżnienia pól; przewodnik: pola tekstowe, Zamień obraz, pola z PDF; test pdf-fields (16 ×2) (release 20261028-05)
</commit_message>
<xml_diff>
--- a/docs/samples/przewodnik.docx
+++ b/docs/samples/przewodnik.docx
@@ -1053,6 +1053,11 @@
     <w:p>
       <w:r>
         <w:t xml:space="preserve">Obraz w dokumencie zmieniasz w trybie Edycja: kliknięcie obrazu pokazuje kartę z suwakiem szerokości (procent szerokości tekstu), wyrównaniem, tekstem alternatywnym i usuwaniem.</w:t>
+      </w:r>
+    </w:p>
+    <w:p>
+      <w:r>
+        <w:t xml:space="preserve">„Zamień obraz” na tej karcie wstawia nowy plik w to samo miejsce i w tym samym rozmiarze — układ strony się nie rusza (np. nowa mapka w karcie terenu). Gdy proporcje są inne, brzegi są przycinane („Wypełnij”); przycisk obok pokazuje cały obraz z białymi pasami. To samo zrobisz, przeciągając plik na obraz albo wklejając obraz, gdy jest zaznaczony.</w:t>
       </w:r>
     </w:p>
     <w:p>
@@ -1271,6 +1276,11 @@
       </w:r>
     </w:p>
     <w:p>
+      <w:r>
+        <w:t xml:space="preserve">„＋ Wstaw → Pole tekstowe” stawia napis w dowolnym miejscu strony, jak w Wordzie — np. „ok 34 m.” obok mapki. Od razu piszesz w środku; Esc kończy. Kliknięcie zaznacza pole: przeciągasz je (przyciąga się do marginesów, środka strony, krawędzi obrazów i linijek tekstu — Alt wyłącza), uchwytami zmieniasz szerokość, a karta pod polem zmienia czcionkę, pogrubienie, wyrównanie, ramkę i tło. Drugie kliknięcie (albo Enter) to znowu pisanie, Delete usuwa. Pola tekstowe z plików Worda działają tak samo.</w:t>
+      </w:r>
+    </w:p>
+    <w:p>
       <w:pPr>
         <w:pStyle w:val="Tip"/>
       </w:pPr>
@@ -1369,6 +1379,18 @@
       </w:pPr>
       <w:r>
         <w:t xml:space="preserve">Wypełnione pola formularza PDF trafiają do tekstu z polskimi literami, nawet gdy PDF rysował je bez „Ł” czy „Ś”.</w:t>
+      </w:r>
+    </w:p>
+    <w:p>
+      <w:pPr>
+        <w:pStyle w:val="ListParagraph"/>
+        <w:numPr>
+          <w:ilvl w:val="0"/>
+          <w:numId w:val="1"/>
+        </w:numPr>
+      </w:pPr>
+      <w:r>
+        <w:t xml:space="preserve">Pola formularza PDF (np. „Miejscowość”, „Teren nr”, lista klatek) stają się polami Worda: kliknij, wpisz, Tab przechodzi do następnego pola — także w Wordzie. Kropki zostają jak w PDF. Wyłączysz to w panelu Widok („Konwersja PDF: pola formularza jako pola Worda”) — wtedy wpisy są zwykłym tekstem.</w:t>
       </w:r>
     </w:p>
     <w:p>

</xml_diff>

<commit_message>
Documents Workbench: długość kropek jak na linijce Worda — klik w kropki (tabulator z wypełnieniem) pokazuje uchwyt na ich końcu i kartę ◀ ▶; przeciąganie / przyciski zmieniają pozycję tabulatora akapitu (podgląd na żywo, jeden krok Cofnij; tabulator ze stylu: wyczyść + nowy jak w Wordzie), bez skracania za tekst; Widok mobilny bez zmian; przewodnik: kropki; test tab-leaders (10 ×2) (release 20261028-06, 20261028-07)
</commit_message>
<xml_diff>
--- a/docs/samples/przewodnik.docx
+++ b/docs/samples/przewodnik.docx
@@ -1394,6 +1394,18 @@
       </w:r>
     </w:p>
     <w:p>
+      <w:pPr>
+        <w:pStyle w:val="ListParagraph"/>
+        <w:numPr>
+          <w:ilvl w:val="0"/>
+          <w:numId w:val="1"/>
+        </w:numPr>
+      </w:pPr>
+      <w:r>
+        <w:t xml:space="preserve">Kropki (np. „Miejscowość: …………”) to w Wordzie jeden tabulator z kropkami — kursor nie wchodzi między nie. Kliknij w kropki: na ich końcu pojawi się uchwyt do przeciągnięcia i karta ◀ krótsze / dłuższe ▶ (Shift — o więcej). Backspace tuż za kropkami usuwa je w całości.</w:t>
+      </w:r>
+    </w:p>
+    <w:p>
       <w:r>
         <w:t xml:space="preserve">Skan (zdjęcie strony) — aplikacja zapyta, czy rozpoznać tekst (OCR). Rozpoznany druk staje się zwykłym tekstem, a skan zostaje pod spodem jako tło: kolory, pieczątki i podpisy widać jak w oryginale. Krzywy skan albo kartka włożona bokiem lub do góry nogami jest najpierw prostowana (w dokumencie też). Linie tabel ze skanu stają się prawdziwą tabelą Worda — komórki można edytować. Na tekst zamieniane są tylko słowa rozpoznane z dużą pewnością; pismo odręczne i nieczytelne fragmenty zostają na obrazie bez zmian (rozpoznawanie pisma odręcznego — do poprawy w przyszłości).</w:t>
       </w:r>

</xml_diff>

<commit_message>
Documents Workbench: przewodnik dogoniony do funkcji apki — rozdz. 15 karta z kropkami (różne długości, przyciąganie z ⌘/Ctrl) i pole tekstowe obok, rozdz. 16 malarz formatów, śledzenie zmian, porównanie wersji i korespondencja seryjna, rozdz. 17 Przepisz, Popraw błędy, Zapytaj dokument, Znajdź sens, Ortografia i Autokorekta, w rozdz. 11 Widok mobilny / desktopowy; jednolinijkowa wskazówka pod spisem treści (koniec rozdz. 1 nie wypada na styk marginesu — strony jak w Wordzie: 8); pola tekstowe na dalszych stronach na swoim miejscu — ustawiane ponownie po odstępach między stronami (wisiały ~1000 px wyżej), położenie względem strony/marginesu od kartki akapitu kotwicy, przeciąganie i wstawianie zapisują położenie od góry tej kartki; testy: guide sprawdza wskazówki rozdz. 15–17, nowe liczby stron/rozdziałów/zakładek w page-breaks, integrity i comments2, view-layout czeka na koniec przejścia (release 20261029-03)
</commit_message>
<xml_diff>
--- a/docs/samples/przewodnik.docx
+++ b/docs/samples/przewodnik.docx
@@ -1,6 +1,6 @@
 
 <file path=word/document.xml><?xml version="1.0" encoding="utf-8"?>
-<w:document xmlns:w="http://schemas.openxmlformats.org/wordprocessingml/2006/main" xmlns:r="http://schemas.openxmlformats.org/officeDocument/2006/relationships" xmlns:w14="http://schemas.microsoft.com/office/word/2010/wordml" xmlns:w15="http://schemas.microsoft.com/office/word/2012/wordml">
+<w:document xmlns:w="http://schemas.openxmlformats.org/wordprocessingml/2006/main" xmlns:r="http://schemas.openxmlformats.org/officeDocument/2006/relationships" xmlns:w14="http://schemas.microsoft.com/office/word/2010/wordml" xmlns:w15="http://schemas.microsoft.com/office/word/2012/wordml" xmlns:mc="http://schemas.openxmlformats.org/markup-compatibility/2006" xmlns:wp="http://schemas.openxmlformats.org/drawingml/2006/wordprocessingDrawing" xmlns:a="http://schemas.openxmlformats.org/drawingml/2006/main" xmlns:wps="http://schemas.microsoft.com/office/word/2010/wordprocessingShape" xmlns:v="urn:schemas-microsoft-com:vml" xmlns:o="urn:schemas-microsoft-com:office:office">
   <w:body>
     <w:p>
       <w:pPr>
@@ -228,17 +228,56 @@
     </w:p>
     <w:p>
       <w:pPr>
-        <w:pStyle w:val="Tip"/>
-      </w:pPr>
-      <w:r>
-        <w:rPr>
-          <w:b/>
-          <w:color w:val="1F5FBF"/>
-        </w:rPr>
-        <w:t xml:space="preserve">Spróbuj: </w:t>
-      </w:r>
-      <w:r>
-        <w:t xml:space="preserve">kliknij dowolny rozdział — przeskoczysz do niego. „↩ Wróć” na dole (albo Alt+←) przywróci to miejsce.</w:t>
+        <w:pStyle w:val="TOC1"/>
+      </w:pPr>
+      <w:hyperlink w:anchor="_Guide15" w:history="1">
+        <w:r>
+          <w:rPr>
+            <w:rStyle w:val="Hyperlink"/>
+          </w:rPr>
+          <w:t xml:space="preserve">15. Kropki i pola tekstowe — karta do wypełnienia</w:t>
+        </w:r>
+      </w:hyperlink>
+    </w:p>
+    <w:p>
+      <w:pPr>
+        <w:pStyle w:val="TOC1"/>
+      </w:pPr>
+      <w:hyperlink w:anchor="_Guide16" w:history="1">
+        <w:r>
+          <w:rPr>
+            <w:rStyle w:val="Hyperlink"/>
+          </w:rPr>
+          <w:t xml:space="preserve">16. Malarz formatów, śledzenie zmian i wersje</w:t>
+        </w:r>
+      </w:hyperlink>
+    </w:p>
+    <w:p>
+      <w:pPr>
+        <w:pStyle w:val="TOC1"/>
+      </w:pPr>
+      <w:hyperlink w:anchor="_Guide17" w:history="1">
+        <w:r>
+          <w:rPr>
+            <w:rStyle w:val="Hyperlink"/>
+          </w:rPr>
+          <w:t xml:space="preserve">17. Asystent i słownik na urządzeniu</w:t>
+        </w:r>
+      </w:hyperlink>
+    </w:p>
+    <w:p>
+      <w:pPr>
+        <w:pStyle w:val="Tip"/>
+      </w:pPr>
+      <w:r>
+        <w:rPr>
+          <w:b/>
+          <w:color w:val="1F5FBF"/>
+        </w:rPr>
+        <w:t xml:space="preserve">Spróbuj: </w:t>
+      </w:r>
+      <w:r>
+        <w:t xml:space="preserve">kliknij rozdział, żeby do niego przejść — „↩ Wróć” (Alt+←) wraca tutaj.</w:t>
       </w:r>
     </w:p>
     <w:p>
@@ -1172,181 +1211,6 @@
     </w:p>
     <w:p>
       <w:pPr>
-        <w:pStyle w:val="Heading1"/>
-      </w:pPr>
-      <w:bookmarkStart w:id="112" w:name="_Guide12"/>
-      <w:r>
-        <w:t xml:space="preserve">12. Zapis i otwieranie plików</w:t>
-      </w:r>
-      <w:bookmarkEnd w:id="112"/>
-    </w:p>
-    <w:p>
-      <w:r>
-        <w:t xml:space="preserve">„Zapisz” zapisuje zmiany w oryginalnym pliku, jeśli otworzyłeś go przyciskiem „Otwórz”, przeciągnięciem do okna albo przez „Otwórz za pomocą” (Chrome i Edge na komputerze) — o zgodę zapyta raz. W innym wypadku zapyta, gdzie zapisać kopię. „Zapisz jako” zawsze tworzy kopię. Licznik przy „Zapisz” pokazuje, ile zmian czeka na zapis. Plik zostaje zwykłym .docx — otworzysz go w Wordzie, Pages i LibreOffice.</w:t>
-      </w:r>
-    </w:p>
-    <w:p>
-      <w:r>
-        <w:t xml:space="preserve">Zainstalowana aplikacja (Chrome / Edge → „Zainstaluj”) pojawia się w menu „Otwórz za pomocą” przy plikach .docx na Windowsie i Macu, a na Androidzie w „Udostępnij”. Na iPhonie i iPadzie pliki otwierasz z wnętrza aplikacji.</w:t>
-      </w:r>
-    </w:p>
-    <w:p>
-      <w:pPr>
-        <w:pStyle w:val="Tip"/>
-      </w:pPr>
-      <w:r>
-        <w:rPr>
-          <w:b/>
-          <w:color w:val="1F5FBF"/>
-        </w:rPr>
-        <w:t xml:space="preserve">Spróbuj: </w:t>
-      </w:r>
-      <w:r>
-        <w:t xml:space="preserve">zmień coś, zobacz licznik przy „Zapisz”, a potem użyj „Zapisz jako”, żeby mieć własną kopię tego przewodnika.</w:t>
-      </w:r>
-    </w:p>
-    <w:p>
-      <w:pPr>
-        <w:pStyle w:val="Heading1"/>
-      </w:pPr>
-      <w:bookmarkStart w:id="113" w:name="_Guide13"/>
-      <w:r>
-        <w:t xml:space="preserve">13. Tworzenie dokumentu od zera</w:t>
-      </w:r>
-      <w:bookmarkEnd w:id="113"/>
-    </w:p>
-    <w:p>
-      <w:r>
-        <w:t xml:space="preserve">„Nowy dokument” (ekran startowy, menu ⋯, panel Plik albo Ctrl/⌘+Alt+N) tworzy plik od razu w przeglądarce: pusta kartka A4, pismo z polami {{…}} albo notatka z tytułem i nagłówkami. Pierwsze „Zapisz” zapyta o nazwę i miejsce.</w:t>
-      </w:r>
-    </w:p>
-    <w:p>
-      <w:r>
-        <w:t xml:space="preserve">W trybie Edycja na pasku są: „＋ Wstaw” (podział strony, linia pozioma, dzisiejsza data, znaki specjalne), lista stylu akapitu (Normalny, Tytuł, Podtytuł, Nagłówek 1–3, Cytat) i wyrównanie. Nagłówki od razu trafiają do skrótów sekcji, Struktury i spisu treści w Wordzie. Enter na końcu nagłówka zaczyna zwykły tekst, a Ctrl/⌘+Enter przenosi dalszy tekst na nową stronę.</w:t>
-      </w:r>
-    </w:p>
-    <w:p>
-      <w:pPr>
-        <w:pStyle w:val="Tip"/>
-      </w:pPr>
-      <w:r>
-        <w:rPr>
-          <w:b/>
-          <w:color w:val="1F5FBF"/>
-        </w:rPr>
-        <w:t xml:space="preserve">Spróbuj: </w:t>
-      </w:r>
-      <w:r>
-        <w:t xml:space="preserve">kliknij na końcu tego akapitu i wybierz z listy stylu „Nagłówek 2” — pojawi się w skrótach sekcji. Potem „＋ Wstaw” → „Dzisiejsza data”, a na koniec ↶ cofnie jedno i drugie.</w:t>
-      </w:r>
-    </w:p>
-    <w:p>
-      <w:r>
-        <w:t xml:space="preserve">Przycisk listy robi listę punktowaną albo numerowaną (drugi raz — zdejmuje). Tab / Shift+Tab albo „Głębiej / Płycej” w tym samym okienku zmienia poziom punktu; Enter w pustym punkcie kończy listę, a Backspace na początku punktu zdejmuje numerację.</w:t>
-      </w:r>
-    </w:p>
-    <w:p>
-      <w:r>
-        <w:t xml:space="preserve">Ctrl/⌘+K (albo „＋ Wstaw” → „Link…”) robi link z zaznaczonego tekstu — do strony WWW albo do miejsca w tym dokumencie: nagłówka lub obrazu (najechanie na link do obrazu pokazuje jego podgląd bez przewijania, na dotyku przytrzymanie palca). Gdy kursor stoi w linku, pod nim pojawia się mała karta: otwórz, zmień, usuń. W „＋ Wstaw” są też pola formularza (tekst, lista wyboru, data, pole wyboru) — wstawiasz je w środek zdania i dalej piszesz obok — oraz spis treści z nagłówków 1–3, który później aktualizujesz tym samym przyciskiem.</w:t>
-      </w:r>
-    </w:p>
-    <w:p>
-      <w:pPr>
-        <w:pStyle w:val="Tip"/>
-      </w:pPr>
-      <w:r>
-        <w:rPr>
-          <w:b/>
-          <w:color w:val="1F5FBF"/>
-        </w:rPr>
-        <w:t xml:space="preserve">Spróbuj: </w:t>
-      </w:r>
-      <w:r>
-        <w:t xml:space="preserve">zaznacz słowo „spis treści” w zdaniu wyżej, naciśnij Ctrl/⌘+K, przełącz na „Miejsce w dokumencie” i wybierz rozdział 1 — kliknięcie w link (albo „Otwórz” na karcie) przeniesie Cię tam.</w:t>
-      </w:r>
-    </w:p>
-    <w:p>
-      <w:r>
-        <w:t xml:space="preserve">„＋ Wstaw → Tabela” pokazuje siatkę — wybierasz liczbę kolumn i wierszy. Tab przechodzi do następnej komórki, a w ostatniej dokłada wiersz. Gdy kursor stoi w tabeli, na pasku pojawia się przycisk „Tabela”: wiersz powyżej / poniżej, kolumna z lewej / z prawej, usuwanie wiersza, kolumny albo całej tabeli.</w:t>
-      </w:r>
-    </w:p>
-    <w:p>
-      <w:r>
-        <w:t xml:space="preserve">„＋ Wstaw → Obraz…” wstawia zdjęcie z dysku (na telefonie także z aparatu), a Ctrl/⌘+V wkleja zrzut ekranu. Duże zdjęcia są zmniejszane, żeby plik nie puchł. Kliknięcie obrazu pokazuje kartę: suwak szerokości, wyrównanie, tekst alternatywny (opis dla czytników ekranu) i usuwanie — działa też z obrazami z plików Worda.</w:t>
-      </w:r>
-    </w:p>
-    <w:p>
-      <w:r>
-        <w:t xml:space="preserve">„＋ Wstaw → Pole tekstowe” stawia napis w dowolnym miejscu strony, jak w Wordzie — np. „ok 34 m.” obok mapki. Od razu piszesz w środku; Esc kończy. Kliknięcie zaznacza pole: przeciągasz je (przyciąga się do marginesów, środka strony, krawędzi obrazów i linijek tekstu — Alt wyłącza), uchwytami zmieniasz szerokość, a karta pod polem zmienia czcionkę, pogrubienie, wyrównanie, ramkę i tło. Drugie kliknięcie (albo Enter) to znowu pisanie, Delete usuwa. Pola tekstowe z plików Worda działają tak samo.</w:t>
-      </w:r>
-    </w:p>
-    <w:p>
-      <w:pPr>
-        <w:pStyle w:val="Tip"/>
-      </w:pPr>
-      <w:r>
-        <w:rPr>
-          <w:b/>
-          <w:color w:val="1F5FBF"/>
-        </w:rPr>
-        <w:t xml:space="preserve">Spróbuj: </w:t>
-      </w:r>
-      <w:r>
-        <w:t xml:space="preserve">kliknij w komórkę tabeli z rozdziału 8 — na pasku pojawi się „Tabela”; dodaj wiersz poniżej i wpisz coś, przechodząc Tabem.</w:t>
-      </w:r>
-    </w:p>
-    <w:p>
-      <w:r>
-        <w:t xml:space="preserve">Przycisk „A” na pasku to kolor czcionki (paleta jak w Wordzie, „Automatyczny”, „Więcej kolorów…”) i wyróżnienie tekstu (zakreślacz). Bez zaznaczenia kolor obowiązuje dla dalszego pisania.</w:t>
-      </w:r>
-    </w:p>
-    <w:p>
-      <w:r>
-        <w:t xml:space="preserve">Komentarz: zaznacz tekst i Ctrl/⌘+Alt+M (albo „＋ Wstaw → Komentarz”). Pogrubienie, kursywę i podkreślenie w treści komentarza robią te same przyciski B I U na pasku (i Ctrl/⌘+B, I, U); wklejony tekst zachowuje takie formatowanie. Komentowany tekst jest podświetlony; gdy kursor w nim stoi, karta pozwala odpowiedzieć, poprawić treść (ołówek przy komentarzu i przy każdej odpowiedzi), oznaczyć jako rozwiązany albo usunąć. Długi komentarz ma na dole „Więcej ↓”, a karta rośnie razem z przybliżeniem dokumentu. Wszystkie komentarze są też w panelu Recenzja.</w:t>
-      </w:r>
-    </w:p>
-    <w:p>
-      <w:r>
-        <w:t xml:space="preserve">Przycisk „Układ” na pasku (jak karta Układ w Wordzie): marginesy jak w Wordzie (Normalne 2,5 cm, Wąskie, Umiarkowane, Szerokie albo własne w cm), orientacja pionowa/pozioma i rozmiar papieru (A4, A5, Letter…) oraz wyrównanie strony w pionie (np. strona tytułowa na środku). Zmiany widać na kartkach w Widoku desktopowym i w Podglądzie wydruku. Marginesy i układ strony są też w menu ⋯ i pod przyciskiem „Marginesy” w Podglądzie wydruku. W Widoku desktopowym strony mają dolny i górny margines oraz przerwę między kartkami — dwuklik w przerwę ukrywa biały obszar (sama kreska), opcja też w panelu Widok.</w:t>
-      </w:r>
-    </w:p>
-    <w:p>
-      <w:r>
-        <w:t xml:space="preserve">„＋ Wstaw → Nagłówek, stopka, numer strony…” (albo kliknięcie w nagłówek/stopkę w Edycji): tekst u góry i na dole każdej strony, numer strony („1”, „Strona 1”, „Strona 1 z 5”, „– 1 –”) i inna pierwsza strona, np. tytułowa bez numeru.</w:t>
-      </w:r>
-    </w:p>
-    <w:p>
-      <w:pPr>
-        <w:pStyle w:val="Tip"/>
-      </w:pPr>
-      <w:r>
-        <w:rPr>
-          <w:b/>
-          <w:color w:val="1F5FBF"/>
-        </w:rPr>
-        <w:t xml:space="preserve">Spróbuj: </w:t>
-      </w:r>
-      <w:r>
-        <w:t xml:space="preserve">zaznacz słowo w tym akapicie i naciśnij Ctrl/⌘+Alt+M; w okienku kliknij B na pasku i dopisz pogrubione słowo, potem „Dodaj komentarz”. Kliknij w podświetlony tekst — ołówkiem poprawisz treść, możesz też odpowiedzieć. Na koniec „Układ” na pasku → „Wąskie”: w Widoku desktopowym kartki od razu mają węższe marginesy (↶ cofa).</w:t>
-      </w:r>
-    </w:p>
-    <w:p>
-      <w:pPr>
-        <w:pStyle w:val="Heading1"/>
-      </w:pPr>
-      <w:bookmarkStart w:id="114" w:name="_Guide14"/>
-      <w:r>
-        <w:t xml:space="preserve">14. PDF → Word (.docx)</w:t>
-      </w:r>
-      <w:bookmarkEnd w:id="114"/>
-    </w:p>
-    <w:p>
-      <w:r>
-        <w:t xml:space="preserve">Otwórz plik .pdf tak jak .docx (Otwórz, przeciągnięcie do okna, „Otwórz za pomocą”) — aplikacja zamieni go w edytowalny dokument Worda. Wszystko dzieje się na tym urządzeniu: plik nigdzie nie jest wysyłany, działa też bez internetu. Okienko pokazuje postęp strona po stronie; „Anuluj” przerywa w każdej chwili.</w:t>
-      </w:r>
-    </w:p>
-    <w:p>
-      <w:pPr>
         <w:pStyle w:val="ListParagraph"/>
         <w:numPr>
           <w:ilvl w:val="0"/>
@@ -1354,7 +1218,182 @@
         </w:numPr>
       </w:pPr>
       <w:r>
-        <w:t xml:space="preserve">Zostają: akapity z wyrównaniem i wcięciami, nagłówki (trafiają do skrótów sekcji i Struktury), punktory, tabele z liniami i tłem komórek, obrazy, linki, spis treści z kropkami, numery stron w stopce, kolumny i układ kilku kart na stronie.</w:t>
+        <w:t xml:space="preserve">Widok mobilny zawija tekst do szerokości ekranu (jak Word na iPhonie), a desktopowy pokazuje kartki jak na wydruku — wybierzesz go przyciskiem z procentem powiększenia; „Auto” dobiera widok do ekranu.</w:t>
+      </w:r>
+    </w:p>
+    <w:p>
+      <w:pPr>
+        <w:pStyle w:val="Heading1"/>
+      </w:pPr>
+      <w:bookmarkStart w:id="112" w:name="_Guide12"/>
+      <w:r>
+        <w:t xml:space="preserve">12. Zapis i otwieranie plików</w:t>
+      </w:r>
+      <w:bookmarkEnd w:id="112"/>
+    </w:p>
+    <w:p>
+      <w:r>
+        <w:t xml:space="preserve">„Zapisz” zapisuje zmiany w oryginalnym pliku, jeśli otworzyłeś go przyciskiem „Otwórz”, przeciągnięciem do okna albo przez „Otwórz za pomocą” (Chrome i Edge na komputerze) — o zgodę zapyta raz. W innym wypadku zapyta, gdzie zapisać kopię. „Zapisz jako” zawsze tworzy kopię. Licznik przy „Zapisz” pokazuje, ile zmian czeka na zapis. Plik zostaje zwykłym .docx — otworzysz go w Wordzie, Pages i LibreOffice.</w:t>
+      </w:r>
+    </w:p>
+    <w:p>
+      <w:r>
+        <w:t xml:space="preserve">Zainstalowana aplikacja (Chrome / Edge → „Zainstaluj”) pojawia się w menu „Otwórz za pomocą” przy plikach .docx na Windowsie i Macu, a na Androidzie w „Udostępnij”. Na iPhonie i iPadzie pliki otwierasz z wnętrza aplikacji.</w:t>
+      </w:r>
+    </w:p>
+    <w:p>
+      <w:pPr>
+        <w:pStyle w:val="Tip"/>
+      </w:pPr>
+      <w:r>
+        <w:rPr>
+          <w:b/>
+          <w:color w:val="1F5FBF"/>
+        </w:rPr>
+        <w:t xml:space="preserve">Spróbuj: </w:t>
+      </w:r>
+      <w:r>
+        <w:t xml:space="preserve">zmień coś, zobacz licznik przy „Zapisz”, a potem użyj „Zapisz jako”, żeby mieć własną kopię tego przewodnika.</w:t>
+      </w:r>
+    </w:p>
+    <w:p>
+      <w:pPr>
+        <w:pStyle w:val="Heading1"/>
+      </w:pPr>
+      <w:bookmarkStart w:id="113" w:name="_Guide13"/>
+      <w:r>
+        <w:t xml:space="preserve">13. Tworzenie dokumentu od zera</w:t>
+      </w:r>
+      <w:bookmarkEnd w:id="113"/>
+    </w:p>
+    <w:p>
+      <w:r>
+        <w:t xml:space="preserve">„Nowy dokument” (ekran startowy, menu ⋯, panel Plik albo Ctrl/⌘+Alt+N) tworzy plik od razu w przeglądarce: pusta kartka A4, pismo z polami {{…}} albo notatka z tytułem i nagłówkami. Pierwsze „Zapisz” zapyta o nazwę i miejsce.</w:t>
+      </w:r>
+    </w:p>
+    <w:p>
+      <w:r>
+        <w:t xml:space="preserve">W trybie Edycja na pasku są: „＋ Wstaw” (podział strony, linia pozioma, dzisiejsza data, znaki specjalne), lista stylu akapitu (Normalny, Tytuł, Podtytuł, Nagłówek 1–3, Cytat) i wyrównanie. Nagłówki od razu trafiają do skrótów sekcji, Struktury i spisu treści w Wordzie. Enter na końcu nagłówka zaczyna zwykły tekst, a Ctrl/⌘+Enter przenosi dalszy tekst na nową stronę.</w:t>
+      </w:r>
+    </w:p>
+    <w:p>
+      <w:pPr>
+        <w:pStyle w:val="Tip"/>
+      </w:pPr>
+      <w:r>
+        <w:rPr>
+          <w:b/>
+          <w:color w:val="1F5FBF"/>
+        </w:rPr>
+        <w:t xml:space="preserve">Spróbuj: </w:t>
+      </w:r>
+      <w:r>
+        <w:t xml:space="preserve">kliknij na końcu tego akapitu i wybierz z listy stylu „Nagłówek 2” — pojawi się w skrótach sekcji. Potem „＋ Wstaw” → „Dzisiejsza data”, a na koniec ↶ cofnie jedno i drugie.</w:t>
+      </w:r>
+    </w:p>
+    <w:p>
+      <w:r>
+        <w:t xml:space="preserve">Przycisk listy robi listę punktowaną albo numerowaną (drugi raz — zdejmuje). Tab / Shift+Tab albo „Głębiej / Płycej” w tym samym okienku zmienia poziom punktu; Enter w pustym punkcie kończy listę, a Backspace na początku punktu zdejmuje numerację.</w:t>
+      </w:r>
+    </w:p>
+    <w:p>
+      <w:r>
+        <w:t xml:space="preserve">Ctrl/⌘+K (albo „＋ Wstaw” → „Link…”) robi link z zaznaczonego tekstu — do strony WWW albo do miejsca w tym dokumencie: nagłówka lub obrazu (najechanie na link do obrazu pokazuje jego podgląd bez przewijania, na dotyku przytrzymanie palca). Gdy kursor stoi w linku, pod nim pojawia się mała karta: otwórz, zmień, usuń. W „＋ Wstaw” są też pola formularza (tekst, lista wyboru, data, pole wyboru) — wstawiasz je w środek zdania i dalej piszesz obok — oraz spis treści z nagłówków 1–3, który później aktualizujesz tym samym przyciskiem.</w:t>
+      </w:r>
+    </w:p>
+    <w:p>
+      <w:pPr>
+        <w:pStyle w:val="Tip"/>
+      </w:pPr>
+      <w:r>
+        <w:rPr>
+          <w:b/>
+          <w:color w:val="1F5FBF"/>
+        </w:rPr>
+        <w:t xml:space="preserve">Spróbuj: </w:t>
+      </w:r>
+      <w:r>
+        <w:t xml:space="preserve">zaznacz słowo „spis treści” w zdaniu wyżej, naciśnij Ctrl/⌘+K, przełącz na „Miejsce w dokumencie” i wybierz rozdział 1 — kliknięcie w link (albo „Otwórz” na karcie) przeniesie Cię tam.</w:t>
+      </w:r>
+    </w:p>
+    <w:p>
+      <w:r>
+        <w:t xml:space="preserve">„＋ Wstaw → Tabela” pokazuje siatkę — wybierasz liczbę kolumn i wierszy. Tab przechodzi do następnej komórki, a w ostatniej dokłada wiersz. Gdy kursor stoi w tabeli, na pasku pojawia się przycisk „Tabela”: wiersz powyżej / poniżej, kolumna z lewej / z prawej, usuwanie wiersza, kolumny albo całej tabeli.</w:t>
+      </w:r>
+    </w:p>
+    <w:p>
+      <w:r>
+        <w:t xml:space="preserve">„＋ Wstaw → Obraz…” wstawia zdjęcie z dysku (na telefonie także z aparatu), a Ctrl/⌘+V wkleja zrzut ekranu. Duże zdjęcia są zmniejszane, żeby plik nie puchł. Kliknięcie obrazu pokazuje kartę: suwak szerokości, wyrównanie, tekst alternatywny (opis dla czytników ekranu) i usuwanie — działa też z obrazami z plików Worda.</w:t>
+      </w:r>
+    </w:p>
+    <w:p>
+      <w:r>
+        <w:t xml:space="preserve">„＋ Wstaw → Pole tekstowe” stawia napis w dowolnym miejscu strony, jak w Wordzie — np. „ok 34 m.” obok mapki. Od razu piszesz w środku; Esc kończy. Kliknięcie zaznacza pole: przeciągasz je (przyciąga się do marginesów, środka strony, krawędzi obrazów i linijek tekstu — Alt wyłącza), uchwytami zmieniasz szerokość, a karta pod polem zmienia czcionkę, pogrubienie, wyrównanie, ramkę i tło. Drugie kliknięcie (albo Enter) to znowu pisanie, Delete usuwa. Pola tekstowe z plików Worda działają tak samo.</w:t>
+      </w:r>
+    </w:p>
+    <w:p>
+      <w:pPr>
+        <w:pStyle w:val="Tip"/>
+      </w:pPr>
+      <w:r>
+        <w:rPr>
+          <w:b/>
+          <w:color w:val="1F5FBF"/>
+        </w:rPr>
+        <w:t xml:space="preserve">Spróbuj: </w:t>
+      </w:r>
+      <w:r>
+        <w:t xml:space="preserve">kliknij w komórkę tabeli z rozdziału 8 — na pasku pojawi się „Tabela”; dodaj wiersz poniżej i wpisz coś, przechodząc Tabem.</w:t>
+      </w:r>
+    </w:p>
+    <w:p>
+      <w:r>
+        <w:t xml:space="preserve">Przycisk „A” na pasku to kolor czcionki (paleta jak w Wordzie, „Automatyczny”, „Więcej kolorów…”) i wyróżnienie tekstu (zakreślacz). Bez zaznaczenia kolor obowiązuje dla dalszego pisania.</w:t>
+      </w:r>
+    </w:p>
+    <w:p>
+      <w:r>
+        <w:t xml:space="preserve">Komentarz: zaznacz tekst i Ctrl/⌘+Alt+M (albo „＋ Wstaw → Komentarz”). Pogrubienie, kursywę i podkreślenie w treści komentarza robią te same przyciski B I U na pasku (i Ctrl/⌘+B, I, U); wklejony tekst zachowuje takie formatowanie. Komentowany tekst jest podświetlony; gdy kursor w nim stoi, karta pozwala odpowiedzieć, poprawić treść (ołówek przy komentarzu i przy każdej odpowiedzi), oznaczyć jako rozwiązany albo usunąć. Długi komentarz ma na dole „Więcej ↓”, a karta rośnie razem z przybliżeniem dokumentu. Wszystkie komentarze są też w panelu Recenzja.</w:t>
+      </w:r>
+    </w:p>
+    <w:p>
+      <w:r>
+        <w:t xml:space="preserve">Przycisk „Układ” na pasku (jak karta Układ w Wordzie): marginesy jak w Wordzie (Normalne 2,5 cm, Wąskie, Umiarkowane, Szerokie albo własne w cm), orientacja pionowa/pozioma i rozmiar papieru (A4, A5, Letter…) oraz wyrównanie strony w pionie (np. strona tytułowa na środku). Zmiany widać na kartkach w Widoku desktopowym i w Podglądzie wydruku. Marginesy i układ strony są też w menu ⋯ i pod przyciskiem „Marginesy” w Podglądzie wydruku. W Widoku desktopowym strony mają dolny i górny margines oraz przerwę między kartkami — dwuklik w przerwę ukrywa biały obszar (sama kreska), opcja też w panelu Widok.</w:t>
+      </w:r>
+    </w:p>
+    <w:p>
+      <w:r>
+        <w:t xml:space="preserve">„＋ Wstaw → Nagłówek, stopka, numer strony…” (albo kliknięcie w nagłówek/stopkę w Edycji): tekst u góry i na dole każdej strony, numer strony („1”, „Strona 1”, „Strona 1 z 5”, „– 1 –”) i inna pierwsza strona, np. tytułowa bez numeru.</w:t>
+      </w:r>
+    </w:p>
+    <w:p>
+      <w:pPr>
+        <w:pStyle w:val="Tip"/>
+      </w:pPr>
+      <w:r>
+        <w:rPr>
+          <w:b/>
+          <w:color w:val="1F5FBF"/>
+        </w:rPr>
+        <w:t xml:space="preserve">Spróbuj: </w:t>
+      </w:r>
+      <w:r>
+        <w:t xml:space="preserve">zaznacz słowo w tym akapicie i naciśnij Ctrl/⌘+Alt+M; w okienku kliknij B na pasku i dopisz pogrubione słowo, potem „Dodaj komentarz”. Kliknij w podświetlony tekst — ołówkiem poprawisz treść, możesz też odpowiedzieć. Na koniec „Układ” na pasku → „Wąskie”: w Widoku desktopowym kartki od razu mają węższe marginesy (↶ cofa).</w:t>
+      </w:r>
+    </w:p>
+    <w:p>
+      <w:pPr>
+        <w:pStyle w:val="Heading1"/>
+      </w:pPr>
+      <w:bookmarkStart w:id="114" w:name="_Guide14"/>
+      <w:r>
+        <w:t xml:space="preserve">14. PDF → Word (.docx)</w:t>
+      </w:r>
+      <w:bookmarkEnd w:id="114"/>
+    </w:p>
+    <w:p>
+      <w:r>
+        <w:t xml:space="preserve">Otwórz plik .pdf tak jak .docx (Otwórz, przeciągnięcie do okna, „Otwórz za pomocą”) — aplikacja zamieni go w edytowalny dokument Worda. Wszystko dzieje się na tym urządzeniu: plik nigdzie nie jest wysyłany, działa też bez internetu. Okienko pokazuje postęp strona po stronie; „Anuluj” przerywa w każdej chwili.</w:t>
       </w:r>
     </w:p>
     <w:p>
@@ -1366,7 +1405,7 @@
         </w:numPr>
       </w:pPr>
       <w:r>
-        <w:t xml:space="preserve">Czcionki z PDF są osadzane w pliku, gdy na komputerze może ich brakować — tekst zawija się jak w oryginale.</w:t>
+        <w:t xml:space="preserve">Zostają: akapity z wyrównaniem i wcięciami, nagłówki (trafiają do skrótów sekcji i Struktury), punktory, tabele z liniami i tłem komórek, obrazy, linki, spis treści z kropkami, numery stron w stopce, kolumny i układ kilku kart na stronie.</w:t>
       </w:r>
     </w:p>
     <w:p>
@@ -1378,7 +1417,7 @@
         </w:numPr>
       </w:pPr>
       <w:r>
-        <w:t xml:space="preserve">Wypełnione pola formularza PDF trafiają do tekstu z polskimi literami, nawet gdy PDF rysował je bez „Ł” czy „Ś”.</w:t>
+        <w:t xml:space="preserve">Czcionki z PDF są osadzane w pliku, gdy na komputerze może ich brakować — tekst zawija się jak w oryginale.</w:t>
       </w:r>
     </w:p>
     <w:p>
@@ -1390,7 +1429,7 @@
         </w:numPr>
       </w:pPr>
       <w:r>
-        <w:t xml:space="preserve">Pola formularza PDF (np. „Miejscowość”, „Teren nr”, lista klatek) stają się polami Worda: kliknij, wpisz, Tab przechodzi do następnego pola — także w Wordzie. Kropki zostają jak w PDF. Wyłączysz to w panelu Widok („Konwersja PDF: pola formularza jako pola Worda”) — wtedy wpisy są zwykłym tekstem.</w:t>
+        <w:t xml:space="preserve">Wypełnione pola formularza PDF trafiają do tekstu z polskimi literami, nawet gdy PDF rysował je bez „Ł” czy „Ś”.</w:t>
       </w:r>
     </w:p>
     <w:p>
@@ -1402,6 +1441,18 @@
         </w:numPr>
       </w:pPr>
       <w:r>
+        <w:t xml:space="preserve">Pola formularza PDF (np. „Miejscowość”, „Teren nr”, lista klatek) stają się polami Worda: kliknij, wpisz, Tab przechodzi do następnego pola — także w Wordzie. Kropki zostają jak w PDF. Wyłączysz to w panelu Widok („Konwersja PDF: pola formularza jako pola Worda”) — wtedy wpisy są zwykłym tekstem.</w:t>
+      </w:r>
+    </w:p>
+    <w:p>
+      <w:pPr>
+        <w:pStyle w:val="ListParagraph"/>
+        <w:numPr>
+          <w:ilvl w:val="0"/>
+          <w:numId w:val="1"/>
+        </w:numPr>
+      </w:pPr>
+      <w:r>
         <w:t xml:space="preserve">Kropki (np. „Miejscowość: …………”) to w Wordzie jeden tabulator z kropkami — kursor nie wchodzi między nie. Kliknij w kropki: na ich końcu pojawi się uchwyt do przeciągnięcia i karta ◀ krótsze / dłuższe ▶ (Shift — o więcej). Kropki zaznaczasz jak tekst: przeciągnięciem razem z sąsiednimi słowami albo dwuklikiem w same kropki — wtedy Delete / Backspace je usuwa, a pisanie wstawia tekst w ich miejsce.</w:t>
       </w:r>
     </w:p>
@@ -1443,6 +1494,399 @@
       </w:r>
       <w:r>
         <w:t xml:space="preserve">zapisz dowolną stronę WWW jako PDF (Drukuj → Zapisz jako PDF) i otwórz ją tutaj — zobaczysz, jak wygląda po zamianie na Worda.</w:t>
+      </w:r>
+    </w:p>
+    <w:p>
+      <w:pPr>
+        <w:pStyle w:val="Heading1"/>
+      </w:pPr>
+      <w:bookmarkStart w:id="115" w:name="_Guide15"/>
+      <w:r>
+        <w:t xml:space="preserve">15. Kropki i pola tekstowe — karta do wypełnienia</w:t>
+      </w:r>
+      <w:bookmarkEnd w:id="115"/>
+    </w:p>
+    <w:p>
+      <w:r>
+        <w:t xml:space="preserve">Tak wygląda karta po zamianie PDF na Worda: etykiety z kropkami do wpisania i dopisek w polu tekstowym obok. Możesz ją też zrobić sam — tabulator z kropkami ustawisz w Wordzie, a pole tekstowe wstawisz przez „＋ Wstaw → Pole tekstowe”.</w:t>
+      </w:r>
+    </w:p>
+    <w:p>
+      <w:pPr>
+        <w:tabs>
+          <w:tab w:val="left" w:leader="dot" w:pos="6000"/>
+        </w:tabs>
+      </w:pPr>
+      <w:r>
+        <w:t xml:space="preserve">Miejscowość:</w:t>
+      </w:r>
+      <w:r>
+        <w:tab/>
+      </w:r>
+      <w:r>
+        <w:rPr>
+          <w:noProof/>
+        </w:rPr>
+        <mc:AlternateContent>
+          <mc:Choice Requires="wps">
+            <w:drawing>
+              <wp:anchor distT="45720" distB="45720" distL="114300" distR="114300" simplePos="0" relativeHeight="251659266" behindDoc="0" locked="0" layoutInCell="1" allowOverlap="1">
+                <wp:simplePos x="0" y="0"/>
+                <wp:positionH relativeFrom="margin">
+                  <wp:posOffset>4140000</wp:posOffset>
+                </wp:positionH>
+                <wp:positionV relativeFrom="paragraph">
+                  <wp:posOffset>0</wp:posOffset>
+                </wp:positionV>
+                <wp:extent cx="1656000" cy="324000"/>
+                <wp:effectExtent l="0" t="0" r="0" b="0"/>
+                <wp:wrapNone/>
+                <wp:docPr id="2" name="Pole tekstowe 2"/>
+                <wp:cNvGraphicFramePr/>
+                <a:graphic>
+                  <a:graphicData uri="http://schemas.microsoft.com/office/word/2010/wordprocessingShape">
+                    <wps:wsp>
+                      <wps:cNvSpPr txBox="1"/>
+                      <wps:spPr>
+                        <a:xfrm>
+                          <a:off x="0" y="0"/>
+                          <a:ext cx="1656000" cy="324000"/>
+                        </a:xfrm>
+                        <a:prstGeom prst="rect">
+                          <a:avLst/>
+                        </a:prstGeom>
+                        <a:solidFill>
+                          <a:srgbClr val="FFFFFF"/>
+                        </a:solidFill>
+                        <a:ln w="9525">
+                          <a:solidFill>
+                            <a:srgbClr val="1F5FBF"/>
+                          </a:solidFill>
+                          <a:miter lim="800000"/>
+                        </a:ln>
+                      </wps:spPr>
+                      <wps:txbx>
+                        <w:txbxContent>
+                          <w:p>
+                            <w:pPr>
+                              <w:spacing w:before="0" w:after="0" w:line="240" w:lineRule="auto"/>
+                              <w:jc w:val="center"/>
+                            </w:pPr>
+                            <w:r>
+                              <w:rPr>
+                                <w:sz w:val="20"/>
+                              </w:rPr>
+                              <w:t xml:space="preserve">ok. 34 m od drogi</w:t>
+                            </w:r>
+                          </w:p>
+                        </w:txbxContent>
+                      </wps:txbx>
+                      <wps:bodyPr rot="0" vert="horz" wrap="square" lIns="91440" tIns="45720" rIns="91440" bIns="45720" anchor="t" anchorCtr="0">
+                        <a:spAutoFit/>
+                      </wps:bodyPr>
+                    </wps:wsp>
+                  </a:graphicData>
+                </a:graphic>
+              </wp:anchor>
+            </w:drawing>
+          </mc:Choice>
+          <mc:Fallback>
+            <w:pict>
+              <v:rect id="Pole tekstowe 2" style="position:absolute;margin-left:326.03pt;margin-top:0;width:130.41pt;height:25.52pt;z-index:2;mso-wrap-style:square;mso-position-horizontal-relative:margin;mso-position-vertical-relative:text" filled="t" fillcolor="white" stroked="t" strokecolor="#1F5FBF" strokeweight=".75pt">
+                <v:textbox style="mso-fit-shape-to-text:t">
+                  <w:txbxContent>
+                    <w:p>
+                      <w:pPr>
+                        <w:spacing w:before="0" w:after="0" w:line="240" w:lineRule="auto"/>
+                        <w:jc w:val="center"/>
+                      </w:pPr>
+                      <w:r>
+                        <w:rPr>
+                          <w:sz w:val="20"/>
+                        </w:rPr>
+                        <w:t xml:space="preserve">ok. 34 m od drogi</w:t>
+                      </w:r>
+                    </w:p>
+                  </w:txbxContent>
+                </v:textbox>
+              </v:rect>
+            </w:pict>
+          </mc:Fallback>
+        </mc:AlternateContent>
+      </w:r>
+    </w:p>
+    <w:p>
+      <w:pPr>
+        <w:tabs>
+          <w:tab w:val="left" w:leader="dot" w:pos="4800"/>
+        </w:tabs>
+      </w:pPr>
+      <w:r>
+        <w:t xml:space="preserve">Teren nr:</w:t>
+      </w:r>
+      <w:r>
+        <w:tab/>
+      </w:r>
+    </w:p>
+    <w:p>
+      <w:pPr>
+        <w:tabs>
+          <w:tab w:val="left" w:leader="dot" w:pos="6000"/>
+        </w:tabs>
+      </w:pPr>
+      <w:r>
+        <w:t xml:space="preserve">Data wydania:</w:t>
+      </w:r>
+      <w:r>
+        <w:tab/>
+      </w:r>
+    </w:p>
+    <w:p>
+      <w:pPr>
+        <w:pStyle w:val="Tip"/>
+      </w:pPr>
+      <w:r>
+        <w:rPr>
+          <w:b/>
+          <w:color w:val="1F5FBF"/>
+        </w:rPr>
+        <w:t xml:space="preserve">Spróbuj: </w:t>
+      </w:r>
+      <w:r>
+        <w:t xml:space="preserve">przełącz na Edycja i kliknij w kropki przy „Teren nr:” — na ich końcu pojawi się uchwyt. Przeciągnij go z wciśniętym ⌘ (Mac) albo Ctrl: koniec kropek przyciągnie się do końca kropek w wierszu obok, a różowa linia pokaże, do czego. Bez klawisza przesuwasz swobodnie, a karta ◀ ▶ skraca i wydłuża kropki krokami.</w:t>
+      </w:r>
+    </w:p>
+    <w:p>
+      <w:r>
+        <w:t xml:space="preserve">Wpisz coś za „Miejscowość:” przed kropkami — kropki same się skracają, a koniec wiersza zostaje na miejscu. Dwuklik w kropki zaznacza je jak słowo: Delete je usuwa, pisanie wstawia tekst w ich miejsce.</w:t>
+      </w:r>
+    </w:p>
+    <w:p>
+      <w:pPr>
+        <w:pStyle w:val="Tip"/>
+      </w:pPr>
+      <w:r>
+        <w:rPr>
+          <w:b/>
+          <w:color w:val="1F5FBF"/>
+        </w:rPr>
+        <w:t xml:space="preserve">Spróbuj: </w:t>
+      </w:r>
+      <w:r>
+        <w:t xml:space="preserve">kliknij pole „ok. 34 m od drogi” — przeciągnij je w inne miejsce: przyciąga się do linii bazowej wiersza obok, brzegów tekstu i marginesów (Alt wyłącza). Drugie kliknięcie albo Enter to pisanie w polu, Esc kończy, a karta pod polem zmienia czcionkę, ramkę i tło.</w:t>
+      </w:r>
+    </w:p>
+    <w:p>
+      <w:pPr>
+        <w:pStyle w:val="Heading1"/>
+      </w:pPr>
+      <w:bookmarkStart w:id="116" w:name="_Guide16"/>
+      <w:r>
+        <w:t xml:space="preserve">16. Malarz formatów, śledzenie zmian i wersje</w:t>
+      </w:r>
+      <w:bookmarkEnd w:id="116"/>
+    </w:p>
+    <w:p>
+      <w:r>
+        <w:t xml:space="preserve">Malarz formatów (pędzel na pasku w trybie Edycja) przenosi wygląd tekstu jak w Wordzie. W tym zdaniu </w:t>
+      </w:r>
+      <w:r>
+        <w:rPr>
+          <w:b/>
+          <w:color w:val="C0392B"/>
+        </w:rPr>
+        <w:t xml:space="preserve">ten fragment ma format</w:t>
+      </w:r>
+      <w:r>
+        <w:t xml:space="preserve">, a ten jest zwykły i czeka na pędzel.</w:t>
+      </w:r>
+    </w:p>
+    <w:p>
+      <w:pPr>
+        <w:pStyle w:val="Tip"/>
+      </w:pPr>
+      <w:r>
+        <w:rPr>
+          <w:b/>
+          <w:color w:val="1F5FBF"/>
+        </w:rPr>
+        <w:t xml:space="preserve">Spróbuj: </w:t>
+      </w:r>
+      <w:r>
+        <w:t xml:space="preserve">postaw kursor w czerwonym fragmencie, kliknij pędzel, a potem zaznacz „ten jest zwykły” — dostanie pogrubienie i kolor. Dwuklik w pędzel zostawia go włączonego dla kolejnych fragmentów (Esc kończy); Ctrl/⌘+Shift+C kopiuje format, a Ctrl/⌘+Shift+V wkleja go na zaznaczenie.</w:t>
+      </w:r>
+    </w:p>
+    <w:p>
+      <w:r>
+        <w:t xml:space="preserve">„Śledź zmiany” w panelu Recenzja działa jak w Wordzie: aplikacja zapyta raz o Twoje imię, a każda zmiana zostaje zapisana jako poprawka z podpisem — dopisany tekst podkreślony, usunięty przekreślony, pasek przy akapicie. W Wordzie zobaczysz te same poprawki do przyjęcia albo odrzucenia.</w:t>
+      </w:r>
+    </w:p>
+    <w:p>
+      <w:pPr>
+        <w:pStyle w:val="Tip"/>
+      </w:pPr>
+      <w:r>
+        <w:rPr>
+          <w:b/>
+          <w:color w:val="1F5FBF"/>
+        </w:rPr>
+        <w:t xml:space="preserve">Spróbuj: </w:t>
+      </w:r>
+      <w:r>
+        <w:t xml:space="preserve">w panelu Recenzja zaznacz „Śledź zmiany”, popraw w tym akapicie jedno słowo i zobacz poprawkę na liście. Potem wyłącz śledzenie i rozstrzygnij poprawkę ✓ albo ✗.</w:t>
+      </w:r>
+    </w:p>
+    <w:p>
+      <w:r>
+        <w:t xml:space="preserve">Porównaj wersje (panel o tej nazwie) zestawia otwarty dokument z drugim plikiem .docx i pokazuje, co dopisano, usunięto albo zmieniono. Porównanie dzieje się na tym urządzeniu i nie zmienia żadnego z plików.</w:t>
+      </w:r>
+    </w:p>
+    <w:p>
+      <w:pPr>
+        <w:pStyle w:val="Tip"/>
+      </w:pPr>
+      <w:r>
+        <w:rPr>
+          <w:b/>
+          <w:color w:val="1F5FBF"/>
+        </w:rPr>
+        <w:t xml:space="preserve">Spróbuj: </w:t>
+      </w:r>
+      <w:r>
+        <w:t xml:space="preserve">„Zapisz jako” zrób kopię przewodnika i zmień w niej kilka słów, a potem otwórz oryginał i w panelu Porównaj wersje wskaż kopię.</w:t>
+      </w:r>
+    </w:p>
+    <w:p>
+      <w:r>
+        <w:t xml:space="preserve">Korespondencja seryjna (panel Placeholdery, pod polami formularza) robi z jednego szablonu wiele dokumentów: tabela CSV albo XLSX, w której pierwszy wiersz to nazwy pól, a każdy kolejny to jeden dokument. Pola z rozdziału </w:t>
+      </w:r>
+      <w:hyperlink w:anchor="_Guide3" w:history="1">
+        <w:r>
+          <w:rPr>
+            <w:rStyle w:val="Hyperlink"/>
+          </w:rPr>
+          <w:t xml:space="preserve">3. Placeholdery</w:t>
+        </w:r>
+      </w:hyperlink>
+      <w:r>
+        <w:t xml:space="preserve"> pasują od razu — wystarczą kolumny data_podpisania, miasto, wynajmujacy, najemca i kwota.</w:t>
+      </w:r>
+    </w:p>
+    <w:p>
+      <w:pPr>
+        <w:pStyle w:val="Tip"/>
+      </w:pPr>
+      <w:r>
+        <w:rPr>
+          <w:b/>
+          <w:color w:val="1F5FBF"/>
+        </w:rPr>
+        <w:t xml:space="preserve">Spróbuj: </w:t>
+      </w:r>
+      <w:r>
+        <w:t xml:space="preserve">przygotuj w Excelu (albo w Sheet Workbench) taką tabelę z dwoma wierszami danych, w panelu Placeholdery kliknij „Wczytaj dane (CSV / XLSX)”, obejrzyj „Podgląd” wiersza i „Utwórz dokumenty (ZIP)” — dostaniesz dwa gotowe pliki .docx. Nazwy plików mogą pochodzić z wybranej kolumny.</w:t>
+      </w:r>
+    </w:p>
+    <w:p>
+      <w:pPr>
+        <w:pStyle w:val="Heading1"/>
+      </w:pPr>
+      <w:bookmarkStart w:id="117" w:name="_Guide17"/>
+      <w:r>
+        <w:t xml:space="preserve">17. Asystent i słownik na urządzeniu</w:t>
+      </w:r>
+      <w:bookmarkEnd w:id="117"/>
+    </w:p>
+    <w:p>
+      <w:r>
+        <w:t xml:space="preserve">Wszystko w tym rozdziale działa na tym urządzeniu — tekst nie wychodzi z przeglądarki. Asystenta AI (mały model językowy) pobierasz raz, za Twoją zgodą; bez niego część funkcji działa na samym słowniku.</w:t>
+      </w:r>
+    </w:p>
+    <w:p>
+      <w:pPr>
+        <w:pStyle w:val="ListParagraph"/>
+        <w:numPr>
+          <w:ilvl w:val="0"/>
+          <w:numId w:val="1"/>
+        </w:numPr>
+      </w:pPr>
+      <w:r>
+        <w:t xml:space="preserve">„Przepisz” (pasek w trybie Edycja): nowa wersja akapitu, zaznaczenia albo kilku akapitów — prościej, krócej, uprzejmiej albo według własnego polecenia. Propozycję wstawisz jako poprawkę do przejrzenia w Recenzji albo od razu.</w:t>
+      </w:r>
+    </w:p>
+    <w:p>
+      <w:pPr>
+        <w:pStyle w:val="ListParagraph"/>
+        <w:numPr>
+          <w:ilvl w:val="0"/>
+          <w:numId w:val="1"/>
+        </w:numPr>
+      </w:pPr>
+      <w:r>
+        <w:t xml:space="preserve">„Popraw błędy” w tym samym okienku działa bez asystenta: słownik poprawia polskie znaki i literówki w akapicie, zaznaczeniu albo w całym dokumencie, a nazw, kodu i pól do wypełnienia nie rusza.</w:t>
+      </w:r>
+    </w:p>
+    <w:p>
+      <w:pPr>
+        <w:pStyle w:val="ListParagraph"/>
+        <w:numPr>
+          <w:ilvl w:val="0"/>
+          <w:numId w:val="1"/>
+        </w:numPr>
+      </w:pPr>
+      <w:r>
+        <w:t xml:space="preserve">Zapytaj dokument (panel): pytanie zwykłymi słowami, odpowiedź z tego dokumentu z numerem miejsca, z którego pochodzi — kliknięcie numeru przewija do fragmentu.</w:t>
+      </w:r>
+    </w:p>
+    <w:p>
+      <w:pPr>
+        <w:pStyle w:val="ListParagraph"/>
+        <w:numPr>
+          <w:ilvl w:val="0"/>
+          <w:numId w:val="1"/>
+        </w:numPr>
+      </w:pPr>
+      <w:r>
+        <w:t xml:space="preserve">Znajdź sens (panel): szukanie po znaczeniu, nie po literach — „wypowiedzenie” znajdzie też „rozwiązanie umowy”.</w:t>
+      </w:r>
+    </w:p>
+    <w:p>
+      <w:pPr>
+        <w:pStyle w:val="ListParagraph"/>
+        <w:numPr>
+          <w:ilvl w:val="0"/>
+          <w:numId w:val="1"/>
+        </w:numPr>
+      </w:pPr>
+      <w:r>
+        <w:t xml:space="preserve">Ortografia (panel Korekta): słowa spoza słownika z podpowiedziami; „Do słownika” zapamiętuje słowo tylko na tym urządzeniu.</w:t>
+      </w:r>
+    </w:p>
+    <w:p>
+      <w:pPr>
+        <w:pStyle w:val="ListParagraph"/>
+        <w:numPr>
+          <w:ilvl w:val="0"/>
+          <w:numId w:val="1"/>
+        </w:numPr>
+      </w:pPr>
+      <w:r>
+        <w:t xml:space="preserve">Autokorekta podczas pisania (panel Narzędzia edycji), jak w Wordzie: juz → już, -- → –, 1/2 → ½, wielka litera na początku zdania, cudzysłowy drukarskie i listy z „1. ” albo „* ” na początku akapitu. Ctrl/⌘+Z zaraz po poprawce cofa samą poprawkę.</w:t>
+      </w:r>
+    </w:p>
+    <w:p>
+      <w:pPr>
+        <w:pStyle w:val="Tip"/>
+      </w:pPr>
+      <w:r>
+        <w:rPr>
+          <w:b/>
+          <w:color w:val="1F5FBF"/>
+        </w:rPr>
+        <w:t xml:space="preserve">Spróbuj: </w:t>
+      </w:r>
+      <w:r>
+        <w:t xml:space="preserve">w panelu Zapytaj dokument wpisz „Do którego dnia najemca płaci czynsz?” — odpowiedź wskaże zdanie z rozdziału 2. Potem w trybie Edycja dopisz na końcu tego akapitu „juz” i spację — autokorekta zamieni je na „już”.</w:t>
       </w:r>
     </w:p>
     <w:sectPr>
@@ -1454,7 +1898,7 @@
 </file>
 
 <file path=word/comments.xml><?xml version="1.0" encoding="utf-8"?>
-<w:comments xmlns:w="http://schemas.openxmlformats.org/wordprocessingml/2006/main" xmlns:r="http://schemas.openxmlformats.org/officeDocument/2006/relationships" xmlns:w14="http://schemas.microsoft.com/office/word/2010/wordml" xmlns:w15="http://schemas.microsoft.com/office/word/2012/wordml">
+<w:comments xmlns:w="http://schemas.openxmlformats.org/wordprocessingml/2006/main" xmlns:r="http://schemas.openxmlformats.org/officeDocument/2006/relationships" xmlns:w14="http://schemas.microsoft.com/office/word/2010/wordml" xmlns:w15="http://schemas.microsoft.com/office/word/2012/wordml" xmlns:mc="http://schemas.openxmlformats.org/markup-compatibility/2006" xmlns:wp="http://schemas.openxmlformats.org/drawingml/2006/wordprocessingDrawing" xmlns:a="http://schemas.openxmlformats.org/drawingml/2006/main" xmlns:wps="http://schemas.microsoft.com/office/word/2010/wordprocessingShape" xmlns:v="urn:schemas-microsoft-com:vml" xmlns:o="urn:schemas-microsoft-com:office:office">
   <w:comment w:id="10" w:author="Anna Recenzentka" w:initials="AR" w:date="2026-09-20T10:05:00Z">
     <w:p>
       <w:r>
@@ -1466,7 +1910,7 @@
 </file>
 
 <file path=word/footnotes.xml><?xml version="1.0" encoding="utf-8"?>
-<w:footnotes xmlns:w="http://schemas.openxmlformats.org/wordprocessingml/2006/main" xmlns:r="http://schemas.openxmlformats.org/officeDocument/2006/relationships" xmlns:w14="http://schemas.microsoft.com/office/word/2010/wordml" xmlns:w15="http://schemas.microsoft.com/office/word/2012/wordml">
+<w:footnotes xmlns:w="http://schemas.openxmlformats.org/wordprocessingml/2006/main" xmlns:r="http://schemas.openxmlformats.org/officeDocument/2006/relationships" xmlns:w14="http://schemas.microsoft.com/office/word/2010/wordml" xmlns:w15="http://schemas.microsoft.com/office/word/2012/wordml" xmlns:mc="http://schemas.openxmlformats.org/markup-compatibility/2006" xmlns:wp="http://schemas.openxmlformats.org/drawingml/2006/wordprocessingDrawing" xmlns:a="http://schemas.openxmlformats.org/drawingml/2006/main" xmlns:wps="http://schemas.microsoft.com/office/word/2010/wordprocessingShape" xmlns:v="urn:schemas-microsoft-com:vml" xmlns:o="urn:schemas-microsoft-com:office:office">
   <w:footnote w:type="separator" w:id="-1">
     <w:p>
       <w:r>
@@ -1498,7 +1942,7 @@
 </file>
 
 <file path=word/numbering.xml><?xml version="1.0" encoding="utf-8"?>
-<w:numbering xmlns:w="http://schemas.openxmlformats.org/wordprocessingml/2006/main" xmlns:r="http://schemas.openxmlformats.org/officeDocument/2006/relationships" xmlns:w14="http://schemas.microsoft.com/office/word/2010/wordml" xmlns:w15="http://schemas.microsoft.com/office/word/2012/wordml">
+<w:numbering xmlns:w="http://schemas.openxmlformats.org/wordprocessingml/2006/main" xmlns:r="http://schemas.openxmlformats.org/officeDocument/2006/relationships" xmlns:w14="http://schemas.microsoft.com/office/word/2010/wordml" xmlns:w15="http://schemas.microsoft.com/office/word/2012/wordml" xmlns:mc="http://schemas.openxmlformats.org/markup-compatibility/2006" xmlns:wp="http://schemas.openxmlformats.org/drawingml/2006/wordprocessingDrawing" xmlns:a="http://schemas.openxmlformats.org/drawingml/2006/main" xmlns:wps="http://schemas.microsoft.com/office/word/2010/wordprocessingShape" xmlns:v="urn:schemas-microsoft-com:vml" xmlns:o="urn:schemas-microsoft-com:office:office">
   <w:abstractNum w:abstractNumId="0">
     <w:multiLevelType w:val="hybridMultilevel"/>
     <w:lvl w:ilvl="0">
@@ -1551,7 +1995,7 @@
 </file>
 
 <file path=word/styles.xml><?xml version="1.0" encoding="utf-8"?>
-<w:styles xmlns:w="http://schemas.openxmlformats.org/wordprocessingml/2006/main" xmlns:r="http://schemas.openxmlformats.org/officeDocument/2006/relationships" xmlns:w14="http://schemas.microsoft.com/office/word/2010/wordml" xmlns:w15="http://schemas.microsoft.com/office/word/2012/wordml">
+<w:styles xmlns:w="http://schemas.openxmlformats.org/wordprocessingml/2006/main" xmlns:r="http://schemas.openxmlformats.org/officeDocument/2006/relationships" xmlns:w14="http://schemas.microsoft.com/office/word/2010/wordml" xmlns:w15="http://schemas.microsoft.com/office/word/2012/wordml" xmlns:mc="http://schemas.openxmlformats.org/markup-compatibility/2006" xmlns:wp="http://schemas.openxmlformats.org/drawingml/2006/wordprocessingDrawing" xmlns:a="http://schemas.openxmlformats.org/drawingml/2006/main" xmlns:wps="http://schemas.microsoft.com/office/word/2010/wordprocessingShape" xmlns:v="urn:schemas-microsoft-com:vml" xmlns:o="urn:schemas-microsoft-com:office:office">
   <w:docDefaults>
     <w:rPrDefault>
       <w:rPr>

</xml_diff>